<commit_message>
Remove AWS references across portfolio and resume
</commit_message>
<xml_diff>
--- a/assets/Dhanushree_VM_Resume.docx
+++ b/assets/Dhanushree_VM_Resume.docx
@@ -80,7 +80,7 @@
         <w:t xml:space="preserve">Aspiring Information science and Engineering Undergraduate </w:t>
       </w:r>
       <w:r>
-        <w:t>with hands-on knowledge of Python, Machine Learning, Natural Language Processing (NLP), Generative AI, Django, Django REST Framework, PostgreSQL, SQL, and web development. Experienced in data analysis and AI-oriented projects, with exposure to AWS cloud services and Docker. Seeking to apply Python, AI/ML, data processing, backend, and cloud skills to context-aware AI applications and full-stack software products.</w:t>
+        <w:t>with hands-on knowledge of Python, Machine Learning, Natural Language Processing (NLP), Generative AI, Django, Django REST Framework, PostgreSQL, SQL, and web development. Experienced in data analysis and AI-oriented projects, with hands-on experience in Docker containerization and modern development tools. Seeking to apply Python, AI/ML, data processing, and full-stack development skills to context-aware AI applications and impactful software products.</w:t>
       </w:r>
     </w:p>
     <w:p/>
@@ -385,17 +385,6 @@
       </w:r>
       <w:r>
         <w:t>Python-based Data Analysis, Data Processing, Microsoft Excel</w:t>
-      </w:r>
-    </w:p>
-    <w:p>
-      <w:r>
-        <w:rPr>
-          <w:b/>
-        </w:rPr>
-        <w:t xml:space="preserve">Cloud: </w:t>
-      </w:r>
-      <w:r>
-        <w:t>AWS EC2, AWS Lambda, AWS VPC, AWS DynamoDB</w:t>
       </w:r>
     </w:p>
     <w:p>

</xml_diff>